<commit_message>
fix: update AWS EKS project GitHub URL to notes-app-aws-eks-deployment repo
</commit_message>
<xml_diff>
--- a/Nasir_Hayat_CV.docx
+++ b/Nasir_Hayat_CV.docx
@@ -978,7 +978,7 @@
         </w:rPr>
         <w:t xml:space="preserve"> | </w:t>
       </w:r>
-      <w:hyperlink r:id="rId12">
+      <w:hyperlink r:id="rId13">
         <w:r>
           <w:rPr>
             <w:rFonts w:ascii="Carlito" w:hAnsi="Carlito" w:cs="Carlito"/>
@@ -1123,7 +1123,7 @@
         </w:rPr>
         <w:t xml:space="preserve"> | </w:t>
       </w:r>
-      <w:hyperlink r:id="rId13">
+      <w:hyperlink r:id="rId14">
         <w:r>
           <w:rPr>
             <w:rFonts w:ascii="Carlito" w:hAnsi="Carlito" w:cs="Carlito"/>
@@ -1268,7 +1268,7 @@
         </w:rPr>
         <w:t xml:space="preserve"> | </w:t>
       </w:r>
-      <w:hyperlink r:id="rId14">
+      <w:hyperlink r:id="rId15">
         <w:r>
           <w:rPr>
             <w:rFonts w:ascii="Carlito" w:hAnsi="Carlito" w:cs="Carlito"/>

</xml_diff>

<commit_message>
Update CV: rearrange sections, update headline, training bullets, and portfolio links
</commit_message>
<xml_diff>
--- a/Nasir_Hayat_CV.docx
+++ b/Nasir_Hayat_CV.docx
@@ -20,7 +20,7 @@
     </w:p>
     <w:p>
       <w:pPr>
-        <w:spacing w:before="0" w:after="36" w:line="240" w:lineRule="auto"/>
+        <w:spacing w:before="0" w:after="32" w:line="240" w:lineRule="auto"/>
         <w:jc w:val="center"/>
       </w:pPr>
       <w:r>
@@ -31,12 +31,12 @@
           <w:sz w:val="20"/>
           <w:rFonts w:ascii="Carlito" w:hAnsi="Carlito" w:cs="Carlito"/>
         </w:rPr>
-        <w:t>DevOps Engineer</w:t>
+        <w:t>Junior DevOps &amp; DevSecOps Engineer</w:t>
       </w:r>
     </w:p>
     <w:p>
       <w:pPr>
-        <w:spacing w:before="0" w:after="50" w:line="240" w:lineRule="auto"/>
+        <w:spacing w:before="0" w:after="16" w:line="240" w:lineRule="auto"/>
         <w:jc w:val="center"/>
       </w:pPr>
       <w:r>
@@ -60,6 +60,12 @@
           <w:t xml:space="preserve">nasirhayat.dev@gmail.com</w:t>
         </w:r>
       </w:hyperlink>
+    </w:p>
+    <w:p>
+      <w:pPr>
+        <w:spacing w:before="0" w:after="40" w:line="240" w:lineRule="auto"/>
+        <w:jc w:val="center"/>
+      </w:pPr>
       <w:r>
         <w:rPr>
           <w:rFonts w:ascii="Carlito" w:hAnsi="Carlito"/>
@@ -68,7 +74,7 @@
           <w:sz w:val="18"/>
           <w:rFonts w:ascii="Carlito" w:hAnsi="Carlito" w:cs="Carlito"/>
         </w:rPr>
-        <w:t xml:space="preserve"> | </w:t>
+        <w:t xml:space="preserve">GitHub: </w:t>
       </w:r>
       <w:hyperlink r:id="rId10">
         <w:r>
@@ -78,7 +84,7 @@
             <w:u w:val="single"/>
             <w:sz w:val="18"/>
           </w:rPr>
-          <w:t xml:space="preserve">GitHub</w:t>
+          <w:t xml:space="preserve">github.com/nasirhayat028</w:t>
         </w:r>
       </w:hyperlink>
       <w:r>
@@ -91,6 +97,16 @@
         </w:rPr>
         <w:t xml:space="preserve"> | </w:t>
       </w:r>
+      <w:r>
+        <w:rPr>
+          <w:rFonts w:ascii="Carlito" w:hAnsi="Carlito"/>
+          <w:b w:val="0"/>
+          <w:color w:val="000000"/>
+          <w:sz w:val="18"/>
+          <w:rFonts w:ascii="Carlito" w:hAnsi="Carlito" w:cs="Carlito"/>
+        </w:rPr>
+        <w:t xml:space="preserve">LinkedIn: </w:t>
+      </w:r>
       <w:hyperlink r:id="rId11">
         <w:r>
           <w:rPr>
@@ -99,13 +115,13 @@
             <w:u w:val="single"/>
             <w:sz w:val="18"/>
           </w:rPr>
-          <w:t xml:space="preserve">LinkedIn</w:t>
+          <w:t xml:space="preserve">linkedin.com/in/nasir-hayat-4515202a2</w:t>
         </w:r>
       </w:hyperlink>
     </w:p>
     <w:p>
       <w:pPr>
-        <w:spacing w:before="90" w:after="36" w:line="240" w:lineRule="auto"/>
+        <w:spacing w:before="84" w:after="32" w:line="240" w:lineRule="auto"/>
         <w:jc w:val="left"/>
         <w:pBdr>
           <w:bottom w:val="single" w:sz="6" w:space="1" w:color="000000"/>
@@ -124,7 +140,7 @@
     </w:p>
     <w:p>
       <w:pPr>
-        <w:spacing w:before="12" w:after="44" w:line="269" w:lineRule="auto"/>
+        <w:spacing w:before="10" w:after="36" w:line="266" w:lineRule="auto"/>
         <w:jc w:val="left"/>
       </w:pPr>
       <w:r>
@@ -135,12 +151,12 @@
           <w:sz w:val="18"/>
           <w:rFonts w:ascii="Carlito" w:hAnsi="Carlito" w:cs="Carlito"/>
         </w:rPr>
-        <w:t>DevOps &amp; DevSecOps Learner skilled in automating CI/CD pipelines, securing cloud-native infrastructure, and managing Kubernetes workloads. Hands-on experience integrating shift-left security practices, including SAST, secrets detection, container vulnerability scanning, and DAST, alongside declarative GitOps with Argo CD. Experienced in Linux administration, AWS cloud services, and secure containerized deployments.</w:t>
+        <w:t>Junior DevOps &amp; DevSecOps Engineer skilled in automating CI/CD pipelines, securing cloud-native infrastructure, and managing Kubernetes workloads. Hands-on experience integrating shift-left security practices, including SAST, secrets detection, container vulnerability scanning, and DAST, alongside declarative GitOps with Argo CD. Hands-on practice with Linux, AWS cloud services, and secure containerized deployments.</w:t>
       </w:r>
     </w:p>
     <w:p>
       <w:pPr>
-        <w:spacing w:before="96" w:after="36" w:line="240" w:lineRule="auto"/>
+        <w:spacing w:before="90" w:after="32" w:line="240" w:lineRule="auto"/>
         <w:jc w:val="left"/>
         <w:pBdr>
           <w:bottom w:val="single" w:sz="6" w:space="1" w:color="000000"/>
@@ -159,7 +175,7 @@
     </w:p>
     <w:p>
       <w:pPr>
-        <w:spacing w:before="12" w:after="6" w:line="266" w:lineRule="auto"/>
+        <w:spacing w:before="10" w:after="6" w:line="266" w:lineRule="auto"/>
         <w:jc w:val="left"/>
       </w:pPr>
       <w:r>
@@ -185,7 +201,7 @@
     </w:p>
     <w:p>
       <w:pPr>
-        <w:spacing w:before="0" w:after="30" w:line="266" w:lineRule="auto"/>
+        <w:spacing w:before="0" w:after="24" w:line="266" w:lineRule="auto"/>
         <w:jc w:val="left"/>
       </w:pPr>
       <w:r>
@@ -196,7 +212,7 @@
           <w:sz w:val="18"/>
           <w:rFonts w:ascii="Carlito" w:hAnsi="Carlito" w:cs="Carlito"/>
         </w:rPr>
-        <w:t>2023 – 2027</w:t>
+        <w:t>2023 – Expected 2027</w:t>
       </w:r>
     </w:p>
     <w:p>
@@ -227,7 +243,7 @@
     </w:p>
     <w:p>
       <w:pPr>
-        <w:spacing w:before="0" w:after="40" w:line="266" w:lineRule="auto"/>
+        <w:spacing w:before="0" w:after="36" w:line="266" w:lineRule="auto"/>
         <w:jc w:val="left"/>
       </w:pPr>
       <w:r>
@@ -243,7 +259,7 @@
     </w:p>
     <w:p>
       <w:pPr>
-        <w:spacing w:before="96" w:after="36" w:line="240" w:lineRule="auto"/>
+        <w:spacing w:before="90" w:after="32" w:line="240" w:lineRule="auto"/>
         <w:jc w:val="left"/>
         <w:pBdr>
           <w:bottom w:val="single" w:sz="6" w:space="1" w:color="000000"/>
@@ -262,7 +278,7 @@
     </w:p>
     <w:p>
       <w:pPr>
-        <w:spacing w:before="0" w:after="20" w:line="266" w:lineRule="auto"/>
+        <w:spacing w:before="0" w:after="18" w:line="266" w:lineRule="auto"/>
         <w:jc w:val="left"/>
       </w:pPr>
       <w:r>
@@ -288,7 +304,7 @@
     </w:p>
     <w:p>
       <w:pPr>
-        <w:spacing w:before="0" w:after="20" w:line="266" w:lineRule="auto"/>
+        <w:spacing w:before="0" w:after="18" w:line="266" w:lineRule="auto"/>
         <w:jc w:val="left"/>
       </w:pPr>
       <w:r>
@@ -314,7 +330,7 @@
     </w:p>
     <w:p>
       <w:pPr>
-        <w:spacing w:before="0" w:after="20" w:line="266" w:lineRule="auto"/>
+        <w:spacing w:before="0" w:after="18" w:line="266" w:lineRule="auto"/>
         <w:jc w:val="left"/>
       </w:pPr>
       <w:r>
@@ -340,7 +356,7 @@
     </w:p>
     <w:p>
       <w:pPr>
-        <w:spacing w:before="0" w:after="20" w:line="266" w:lineRule="auto"/>
+        <w:spacing w:before="0" w:after="18" w:line="266" w:lineRule="auto"/>
         <w:jc w:val="left"/>
       </w:pPr>
       <w:r>
@@ -366,7 +382,7 @@
     </w:p>
     <w:p>
       <w:pPr>
-        <w:spacing w:before="0" w:after="20" w:line="266" w:lineRule="auto"/>
+        <w:spacing w:before="0" w:after="18" w:line="266" w:lineRule="auto"/>
         <w:jc w:val="left"/>
       </w:pPr>
       <w:r>
@@ -392,7 +408,7 @@
     </w:p>
     <w:p>
       <w:pPr>
-        <w:spacing w:before="0" w:after="20" w:line="266" w:lineRule="auto"/>
+        <w:spacing w:before="0" w:after="18" w:line="266" w:lineRule="auto"/>
         <w:jc w:val="left"/>
       </w:pPr>
       <w:r>
@@ -418,7 +434,7 @@
     </w:p>
     <w:p>
       <w:pPr>
-        <w:spacing w:before="0" w:after="20" w:line="266" w:lineRule="auto"/>
+        <w:spacing w:before="0" w:after="18" w:line="266" w:lineRule="auto"/>
         <w:jc w:val="left"/>
       </w:pPr>
       <w:r>
@@ -444,7 +460,7 @@
     </w:p>
     <w:p>
       <w:pPr>
-        <w:spacing w:before="0" w:after="20" w:line="266" w:lineRule="auto"/>
+        <w:spacing w:before="0" w:after="18" w:line="266" w:lineRule="auto"/>
         <w:jc w:val="left"/>
       </w:pPr>
       <w:r>
@@ -470,7 +486,7 @@
     </w:p>
     <w:p>
       <w:pPr>
-        <w:spacing w:before="0" w:after="20" w:line="266" w:lineRule="auto"/>
+        <w:spacing w:before="0" w:after="18" w:line="266" w:lineRule="auto"/>
         <w:jc w:val="left"/>
       </w:pPr>
       <w:r>
@@ -496,106 +512,7 @@
     </w:p>
     <w:p>
       <w:pPr>
-        <w:spacing w:before="96" w:after="36" w:line="240" w:lineRule="auto"/>
-        <w:jc w:val="left"/>
-        <w:pBdr>
-          <w:bottom w:val="single" w:sz="6" w:space="1" w:color="000000"/>
-        </w:pBdr>
-      </w:pPr>
-      <w:r>
-        <w:rPr>
-          <w:rFonts w:ascii="Carlito" w:hAnsi="Carlito"/>
-          <w:b/>
-          <w:color w:val="000000"/>
-          <w:sz w:val="20"/>
-          <w:rFonts w:ascii="Carlito" w:hAnsi="Carlito" w:cs="Carlito"/>
-        </w:rPr>
-        <w:t>TRAINING</w:t>
-      </w:r>
-    </w:p>
-    <w:p>
-      <w:pPr>
-        <w:spacing w:before="12" w:after="20" w:line="266" w:lineRule="auto"/>
-        <w:jc w:val="left"/>
-      </w:pPr>
-      <w:r>
-        <w:rPr>
-          <w:rFonts w:ascii="Carlito" w:hAnsi="Carlito"/>
-          <w:b/>
-          <w:color w:val="000000"/>
-          <w:sz w:val="18"/>
-          <w:rFonts w:ascii="Carlito" w:hAnsi="Carlito" w:cs="Carlito"/>
-        </w:rPr>
-        <w:t>AWS re/Start Graduate</w:t>
-      </w:r>
-      <w:r>
-        <w:rPr>
-          <w:rFonts w:ascii="Carlito" w:hAnsi="Carlito"/>
-          <w:b w:val="0"/>
-          <w:color w:val="000000"/>
-          <w:sz w:val="18"/>
-          <w:rFonts w:ascii="Carlito" w:hAnsi="Carlito" w:cs="Carlito"/>
-        </w:rPr>
-        <w:t xml:space="preserve"> | LearnTechGlobal (AWS re/Start program) | Aug 2026 – Present</w:t>
-      </w:r>
-    </w:p>
-    <w:p>
-      <w:pPr>
-        <w:spacing w:before="0" w:after="20" w:line="266" w:lineRule="auto"/>
-        <w:ind w:left="259" w:hanging="187"/>
-        <w:jc w:val="left"/>
-      </w:pPr>
-      <w:r>
-        <w:rPr>
-          <w:rFonts w:ascii="Carlito" w:hAnsi="Carlito"/>
-          <w:b w:val="0"/>
-          <w:color w:val="000000"/>
-          <w:sz w:val="18"/>
-          <w:rFonts w:ascii="Carlito" w:hAnsi="Carlito" w:cs="Carlito"/>
-        </w:rPr>
-        <w:t xml:space="preserve">• </w:t>
-      </w:r>
-      <w:r>
-        <w:rPr>
-          <w:rFonts w:ascii="Carlito" w:hAnsi="Carlito"/>
-          <w:b w:val="0"/>
-          <w:color w:val="000000"/>
-          <w:sz w:val="18"/>
-          <w:rFonts w:ascii="Carlito" w:hAnsi="Carlito" w:cs="Carlito"/>
-        </w:rPr>
-        <w:t>Completed an intensive cloud skills program covering Linux, networking, security fundamentals, and core AWS services (EC2, VPC, S3, IAM, CloudWatch).</w:t>
-      </w:r>
-    </w:p>
-    <w:p>
-      <w:pPr>
-        <w:spacing w:before="0" w:after="36" w:line="266" w:lineRule="auto"/>
-        <w:ind w:left="259" w:hanging="187"/>
-        <w:jc w:val="left"/>
-      </w:pPr>
-      <w:r>
-        <w:rPr>
-          <w:rFonts w:ascii="Carlito" w:hAnsi="Carlito"/>
-          <w:b w:val="0"/>
-          <w:color w:val="000000"/>
-          <w:sz w:val="18"/>
-          <w:rFonts w:ascii="Carlito" w:hAnsi="Carlito" w:cs="Carlito"/>
-        </w:rPr>
-        <w:t xml:space="preserve">• </w:t>
-      </w:r>
-      <w:r>
-        <w:rPr>
-          <w:rFonts w:ascii="Carlito" w:hAnsi="Carlito"/>
-          <w:b w:val="0"/>
-          <w:color w:val="000000"/>
-          <w:sz w:val="18"/>
-          <w:rFonts w:ascii="Carlito" w:hAnsi="Carlito" w:cs="Carlito"/>
-        </w:rPr>
-        <w:t>Performed hands-on labs in live AWS environments via the Canvas learning platform, including [launching EC2 instances, configuring VPC networking, managing IAM users and policies, working with S3].</w:t>
-      </w:r>
-    </w:p>
-    <w:p>
-      <w:pPr>
-        <w:spacing w:before="96" w:after="36" w:line="240" w:lineRule="auto"/>
+        <w:spacing w:before="90" w:after="32" w:line="240" w:lineRule="auto"/>
         <w:jc w:val="left"/>
         <w:pBdr>
           <w:bottom w:val="single" w:sz="6" w:space="1" w:color="000000"/>
@@ -614,7 +531,7 @@
     </w:p>
     <w:p>
       <w:pPr>
-        <w:spacing w:before="12" w:after="6" w:line="266" w:lineRule="auto"/>
+        <w:spacing w:before="10" w:after="6" w:line="266" w:lineRule="auto"/>
         <w:jc w:val="left"/>
       </w:pPr>
       <w:r>
@@ -640,7 +557,7 @@
     </w:p>
     <w:p>
       <w:pPr>
-        <w:spacing w:before="0" w:after="20" w:line="266" w:lineRule="auto"/>
+        <w:spacing w:before="0" w:after="16" w:line="266" w:lineRule="auto"/>
         <w:jc w:val="left"/>
       </w:pPr>
       <w:r>
@@ -737,7 +654,7 @@
     </w:p>
     <w:p>
       <w:pPr>
-        <w:spacing w:before="0" w:after="44" w:line="266" w:lineRule="auto"/>
+        <w:spacing w:before="0" w:after="32" w:line="266" w:lineRule="auto"/>
         <w:ind w:left="259" w:hanging="187"/>
         <w:jc w:val="left"/>
       </w:pPr>
@@ -764,7 +681,106 @@
     </w:p>
     <w:p>
       <w:pPr>
-        <w:spacing w:before="96" w:after="36" w:line="240" w:lineRule="auto"/>
+        <w:spacing w:before="90" w:after="32" w:line="240" w:lineRule="auto"/>
+        <w:jc w:val="left"/>
+        <w:pBdr>
+          <w:bottom w:val="single" w:sz="6" w:space="1" w:color="000000"/>
+        </w:pBdr>
+      </w:pPr>
+      <w:r>
+        <w:rPr>
+          <w:rFonts w:ascii="Carlito" w:hAnsi="Carlito"/>
+          <w:b/>
+          <w:color w:val="000000"/>
+          <w:sz w:val="20"/>
+          <w:rFonts w:ascii="Carlito" w:hAnsi="Carlito" w:cs="Carlito"/>
+        </w:rPr>
+        <w:t>TRAINING</w:t>
+      </w:r>
+    </w:p>
+    <w:p>
+      <w:pPr>
+        <w:spacing w:before="10" w:after="16" w:line="266" w:lineRule="auto"/>
+        <w:jc w:val="left"/>
+      </w:pPr>
+      <w:r>
+        <w:rPr>
+          <w:rFonts w:ascii="Carlito" w:hAnsi="Carlito"/>
+          <w:b/>
+          <w:color w:val="000000"/>
+          <w:sz w:val="18"/>
+          <w:rFonts w:ascii="Carlito" w:hAnsi="Carlito" w:cs="Carlito"/>
+        </w:rPr>
+        <w:t>AWS re/Start Graduate</w:t>
+      </w:r>
+      <w:r>
+        <w:rPr>
+          <w:rFonts w:ascii="Carlito" w:hAnsi="Carlito"/>
+          <w:b w:val="0"/>
+          <w:color w:val="000000"/>
+          <w:sz w:val="18"/>
+          <w:rFonts w:ascii="Carlito" w:hAnsi="Carlito" w:cs="Carlito"/>
+        </w:rPr>
+        <w:t xml:space="preserve"> | LearnTechGlobal (AWS re/Start program) | Aug 2026 – Present</w:t>
+      </w:r>
+    </w:p>
+    <w:p>
+      <w:pPr>
+        <w:spacing w:before="0" w:after="20" w:line="266" w:lineRule="auto"/>
+        <w:ind w:left="259" w:hanging="187"/>
+        <w:jc w:val="left"/>
+      </w:pPr>
+      <w:r>
+        <w:rPr>
+          <w:rFonts w:ascii="Carlito" w:hAnsi="Carlito"/>
+          <w:b w:val="0"/>
+          <w:color w:val="000000"/>
+          <w:sz w:val="18"/>
+          <w:rFonts w:ascii="Carlito" w:hAnsi="Carlito" w:cs="Carlito"/>
+        </w:rPr>
+        <w:t xml:space="preserve">• </w:t>
+      </w:r>
+      <w:r>
+        <w:rPr>
+          <w:rFonts w:ascii="Carlito" w:hAnsi="Carlito"/>
+          <w:b w:val="0"/>
+          <w:color w:val="000000"/>
+          <w:sz w:val="18"/>
+          <w:rFonts w:ascii="Carlito" w:hAnsi="Carlito" w:cs="Carlito"/>
+        </w:rPr>
+        <w:t>Completing an intensive cloud skills program covering Linux, networking, security fundamentals, and core AWS services (EC2, VPC, S3, IAM, CloudWatch).</w:t>
+      </w:r>
+    </w:p>
+    <w:p>
+      <w:pPr>
+        <w:spacing w:before="0" w:after="32" w:line="266" w:lineRule="auto"/>
+        <w:ind w:left="259" w:hanging="187"/>
+        <w:jc w:val="left"/>
+      </w:pPr>
+      <w:r>
+        <w:rPr>
+          <w:rFonts w:ascii="Carlito" w:hAnsi="Carlito"/>
+          <w:b w:val="0"/>
+          <w:color w:val="000000"/>
+          <w:sz w:val="18"/>
+          <w:rFonts w:ascii="Carlito" w:hAnsi="Carlito" w:cs="Carlito"/>
+        </w:rPr>
+        <w:t xml:space="preserve">• </w:t>
+      </w:r>
+      <w:r>
+        <w:rPr>
+          <w:rFonts w:ascii="Carlito" w:hAnsi="Carlito"/>
+          <w:b w:val="0"/>
+          <w:color w:val="000000"/>
+          <w:sz w:val="18"/>
+          <w:rFonts w:ascii="Carlito" w:hAnsi="Carlito" w:cs="Carlito"/>
+        </w:rPr>
+        <w:t>Performing hands-on labs in live AWS environments via the Canvas learning platform, including launching and configuring an EC2 web server with User Data (Apache) and Security Groups, monitoring it with EC2 status checks and CloudWatch metrics, resizing instance and EBS volume, enabling and disabling Termination Protection, and building a VPC with public and private subnets, an Internet Gateway, and route tables, troubleshooting SSH connectivity through the route table.</w:t>
+      </w:r>
+    </w:p>
+    <w:p>
+      <w:pPr>
+        <w:spacing w:before="90" w:after="32" w:line="240" w:lineRule="auto"/>
         <w:jc w:val="left"/>
         <w:pBdr>
           <w:bottom w:val="single" w:sz="6" w:space="1" w:color="000000"/>
@@ -783,7 +799,7 @@
     </w:p>
     <w:p>
       <w:pPr>
-        <w:spacing w:before="12" w:after="20" w:line="266" w:lineRule="auto"/>
+        <w:spacing w:before="10" w:after="16" w:line="266" w:lineRule="auto"/>
         <w:jc w:val="left"/>
       </w:pPr>
       <w:r>
@@ -928,7 +944,7 @@
     </w:p>
     <w:p>
       <w:pPr>
-        <w:spacing w:before="0" w:after="36" w:line="266" w:lineRule="auto"/>
+        <w:spacing w:before="0" w:after="30" w:line="266" w:lineRule="auto"/>
         <w:ind w:left="259" w:hanging="187"/>
         <w:jc w:val="left"/>
       </w:pPr>
@@ -955,7 +971,7 @@
     </w:p>
     <w:p>
       <w:pPr>
-        <w:spacing w:before="16" w:after="20" w:line="266" w:lineRule="auto"/>
+        <w:spacing w:before="12" w:after="16" w:line="266" w:lineRule="auto"/>
         <w:jc w:val="left"/>
       </w:pPr>
       <w:r>
@@ -1073,7 +1089,7 @@
     </w:p>
     <w:p>
       <w:pPr>
-        <w:spacing w:before="0" w:after="36" w:line="266" w:lineRule="auto"/>
+        <w:spacing w:before="0" w:after="30" w:line="266" w:lineRule="auto"/>
         <w:ind w:left="259" w:hanging="187"/>
         <w:jc w:val="left"/>
       </w:pPr>
@@ -1100,7 +1116,7 @@
     </w:p>
     <w:p>
       <w:pPr>
-        <w:spacing w:before="16" w:after="20" w:line="266" w:lineRule="auto"/>
+        <w:spacing w:before="12" w:after="16" w:line="266" w:lineRule="auto"/>
         <w:jc w:val="left"/>
       </w:pPr>
       <w:r>
@@ -1191,7 +1207,7 @@
     </w:p>
     <w:p>
       <w:pPr>
-        <w:spacing w:before="0" w:after="20" w:line="266" w:lineRule="auto"/>
+        <w:spacing w:before="0" w:after="30" w:line="266" w:lineRule="auto"/>
         <w:ind w:left="259" w:hanging="187"/>
         <w:jc w:val="left"/>
       </w:pPr>
@@ -1218,34 +1234,7 @@
     </w:p>
     <w:p>
       <w:pPr>
-        <w:spacing w:before="0" w:after="36" w:line="266" w:lineRule="auto"/>
-        <w:ind w:left="259" w:hanging="187"/>
-        <w:jc w:val="left"/>
-      </w:pPr>
-      <w:r>
-        <w:rPr>
-          <w:rFonts w:ascii="Carlito" w:hAnsi="Carlito"/>
-          <w:b w:val="0"/>
-          <w:color w:val="000000"/>
-          <w:sz w:val="18"/>
-          <w:rFonts w:ascii="Carlito" w:hAnsi="Carlito" w:cs="Carlito"/>
-        </w:rPr>
-        <w:t xml:space="preserve">• </w:t>
-      </w:r>
-      <w:r>
-        <w:rPr>
-          <w:rFonts w:ascii="Carlito" w:hAnsi="Carlito"/>
-          <w:b w:val="0"/>
-          <w:color w:val="000000"/>
-          <w:sz w:val="18"/>
-          <w:rFonts w:ascii="Carlito" w:hAnsi="Carlito" w:cs="Carlito"/>
-        </w:rPr>
-        <w:t>Configured Kubernetes Deployments, Services, Ingress, ConfigMaps, Secrets, resource limits, and health probes</w:t>
-      </w:r>
-    </w:p>
-    <w:p>
-      <w:pPr>
-        <w:spacing w:before="16" w:after="20" w:line="266" w:lineRule="auto"/>
+        <w:spacing w:before="12" w:after="16" w:line="266" w:lineRule="auto"/>
         <w:jc w:val="left"/>
       </w:pPr>
       <w:r>

</xml_diff>

<commit_message>
Update CV: format links with black color and add photo asset
</commit_message>
<xml_diff>
--- a/Nasir_Hayat_CV.docx
+++ b/Nasir_Hayat_CV.docx
@@ -31,12 +31,12 @@
           <w:sz w:val="20"/>
           <w:rFonts w:ascii="Carlito" w:hAnsi="Carlito" w:cs="Carlito"/>
         </w:rPr>
-        <w:t>Junior DevOps &amp; DevSecOps Engineer</w:t>
+        <w:t>DevOps &amp; DevSecOps Engineer</w:t>
       </w:r>
     </w:p>
     <w:p>
       <w:pPr>
-        <w:spacing w:before="0" w:after="16" w:line="240" w:lineRule="auto"/>
+        <w:spacing w:before="0" w:after="40" w:line="240" w:lineRule="auto"/>
         <w:jc w:val="center"/>
       </w:pPr>
       <w:r>
@@ -53,38 +53,11 @@
         <w:r>
           <w:rPr>
             <w:rFonts w:ascii="Carlito" w:hAnsi="Carlito" w:cs="Carlito"/>
-            <w:color w:val="0563C1"/>
+            <w:color w:val="000000"/>
             <w:u w:val="single"/>
             <w:sz w:val="18"/>
           </w:rPr>
           <w:t xml:space="preserve">nasirhayat.dev@gmail.com</w:t>
-        </w:r>
-      </w:hyperlink>
-    </w:p>
-    <w:p>
-      <w:pPr>
-        <w:spacing w:before="0" w:after="40" w:line="240" w:lineRule="auto"/>
-        <w:jc w:val="center"/>
-      </w:pPr>
-      <w:r>
-        <w:rPr>
-          <w:rFonts w:ascii="Carlito" w:hAnsi="Carlito"/>
-          <w:b w:val="0"/>
-          <w:color w:val="000000"/>
-          <w:sz w:val="18"/>
-          <w:rFonts w:ascii="Carlito" w:hAnsi="Carlito" w:cs="Carlito"/>
-        </w:rPr>
-        <w:t xml:space="preserve">GitHub: </w:t>
-      </w:r>
-      <w:hyperlink r:id="rId10">
-        <w:r>
-          <w:rPr>
-            <w:rFonts w:ascii="Carlito" w:hAnsi="Carlito" w:cs="Carlito"/>
-            <w:color w:val="0563C1"/>
-            <w:u w:val="single"/>
-            <w:sz w:val="18"/>
-          </w:rPr>
-          <w:t xml:space="preserve">github.com/nasirhayat028</w:t>
         </w:r>
       </w:hyperlink>
       <w:r>
@@ -97,6 +70,17 @@
         </w:rPr>
         <w:t xml:space="preserve"> | </w:t>
       </w:r>
+      <w:hyperlink r:id="rId10">
+        <w:r>
+          <w:rPr>
+            <w:rFonts w:ascii="Carlito" w:hAnsi="Carlito" w:cs="Carlito"/>
+            <w:color w:val="000000"/>
+            <w:u w:val="single"/>
+            <w:sz w:val="18"/>
+          </w:rPr>
+          <w:t xml:space="preserve">LinkedIn</w:t>
+        </w:r>
+      </w:hyperlink>
       <w:r>
         <w:rPr>
           <w:rFonts w:ascii="Carlito" w:hAnsi="Carlito"/>
@@ -105,17 +89,17 @@
           <w:sz w:val="18"/>
           <w:rFonts w:ascii="Carlito" w:hAnsi="Carlito" w:cs="Carlito"/>
         </w:rPr>
-        <w:t xml:space="preserve">LinkedIn: </w:t>
+        <w:t xml:space="preserve"> | </w:t>
       </w:r>
       <w:hyperlink r:id="rId11">
         <w:r>
           <w:rPr>
             <w:rFonts w:ascii="Carlito" w:hAnsi="Carlito" w:cs="Carlito"/>
-            <w:color w:val="0563C1"/>
+            <w:color w:val="000000"/>
             <w:u w:val="single"/>
             <w:sz w:val="18"/>
           </w:rPr>
-          <w:t xml:space="preserve">linkedin.com/in/nasir-hayat-4515202a2</w:t>
+          <w:t xml:space="preserve">GitHub</w:t>
         </w:r>
       </w:hyperlink>
     </w:p>
@@ -151,7 +135,7 @@
           <w:sz w:val="18"/>
           <w:rFonts w:ascii="Carlito" w:hAnsi="Carlito" w:cs="Carlito"/>
         </w:rPr>
-        <w:t>Junior DevOps &amp; DevSecOps Engineer skilled in automating CI/CD pipelines, securing cloud-native infrastructure, and managing Kubernetes workloads. Hands-on experience integrating shift-left security practices, including SAST, secrets detection, container vulnerability scanning, and DAST, alongside declarative GitOps with Argo CD. Hands-on practice with Linux, AWS cloud services, and secure containerized deployments.</w:t>
+        <w:t>DevOps &amp; DevSecOps Engineer skilled in automating CI/CD pipelines, securing cloud-native infrastructure, and managing Kubernetes workloads. Hands-on experience integrating shift-left security practices, including SAST, secrets detection, container vulnerability scanning, and DAST, alongside declarative GitOps with Argo CD. Hands-on practice with Linux, AWS cloud services, and secure containerized deployments.</w:t>
       </w:r>
     </w:p>
     <w:p>
@@ -826,7 +810,7 @@
         <w:r>
           <w:rPr>
             <w:rFonts w:ascii="Carlito" w:hAnsi="Carlito" w:cs="Carlito"/>
-            <w:color w:val="0563C1"/>
+            <w:color w:val="000000"/>
             <w:u w:val="single"/>
             <w:sz w:val="18"/>
           </w:rPr>
@@ -998,7 +982,7 @@
         <w:r>
           <w:rPr>
             <w:rFonts w:ascii="Carlito" w:hAnsi="Carlito" w:cs="Carlito"/>
-            <w:color w:val="0563C1"/>
+            <w:color w:val="000000"/>
             <w:u w:val="single"/>
             <w:sz w:val="18"/>
           </w:rPr>
@@ -1143,7 +1127,7 @@
         <w:r>
           <w:rPr>
             <w:rFonts w:ascii="Carlito" w:hAnsi="Carlito" w:cs="Carlito"/>
-            <w:color w:val="0563C1"/>
+            <w:color w:val="000000"/>
             <w:u w:val="single"/>
             <w:sz w:val="18"/>
           </w:rPr>
@@ -1261,7 +1245,7 @@
         <w:r>
           <w:rPr>
             <w:rFonts w:ascii="Carlito" w:hAnsi="Carlito" w:cs="Carlito"/>
-            <w:color w:val="0563C1"/>
+            <w:color w:val="000000"/>
             <w:u w:val="single"/>
             <w:sz w:val="18"/>
           </w:rPr>

</xml_diff>

<commit_message>
Update CV: set headline to DevOps Engineer and update summary opening
</commit_message>
<xml_diff>
--- a/Nasir_Hayat_CV.docx
+++ b/Nasir_Hayat_CV.docx
@@ -31,7 +31,7 @@
           <w:sz w:val="20"/>
           <w:rFonts w:ascii="Carlito" w:hAnsi="Carlito" w:cs="Carlito"/>
         </w:rPr>
-        <w:t>DevOps &amp; DevSecOps Engineer</w:t>
+        <w:t>DevOps Engineer</w:t>
       </w:r>
     </w:p>
     <w:p>
@@ -135,7 +135,7 @@
           <w:sz w:val="18"/>
           <w:rFonts w:ascii="Carlito" w:hAnsi="Carlito" w:cs="Carlito"/>
         </w:rPr>
-        <w:t>DevOps &amp; DevSecOps Engineer skilled in automating CI/CD pipelines, securing cloud-native infrastructure, and managing Kubernetes workloads. Hands-on experience integrating shift-left security practices, including SAST, secrets detection, container vulnerability scanning, and DAST, alongside declarative GitOps with Argo CD. Hands-on practice with Linux, AWS cloud services, and secure containerized deployments.</w:t>
+        <w:t>Junior DevOps &amp; DevSecOps Engineer skilled in automating CI/CD pipelines, securing cloud-native infrastructure, and managing Kubernetes workloads. Hands-on experience integrating shift-left security practices, including SAST, secrets detection, container vulnerability scanning, and DAST, alongside declarative GitOps with Argo CD. Hands-on practice with Linux, AWS cloud services, and secure containerized deployments.</w:t>
       </w:r>
     </w:p>
     <w:p>
@@ -695,7 +695,7 @@
           <w:sz w:val="18"/>
           <w:rFonts w:ascii="Carlito" w:hAnsi="Carlito" w:cs="Carlito"/>
         </w:rPr>
-        <w:t>AWS re/Start Graduate</w:t>
+        <w:t>AWS re/Start Program</w:t>
       </w:r>
       <w:r>
         <w:rPr>
@@ -705,7 +705,7 @@
           <w:sz w:val="18"/>
           <w:rFonts w:ascii="Carlito" w:hAnsi="Carlito" w:cs="Carlito"/>
         </w:rPr>
-        <w:t xml:space="preserve"> | LearnTechGlobal (AWS re/Start program) | Aug 2026 – Present</w:t>
+        <w:t xml:space="preserve"> | LearnTechGlobal (AWS re/Start program) | Aug 2026 – Nov 2026 (Expected)</w:t>
       </w:r>
     </w:p>
     <w:p>

</xml_diff>